<commit_message>
Prototipo de Figma rehecho con las seis salidas de Figma Make
- Se reemplazan los siete frames que contenian capturas del prototipo HTML por
  las seis capturas reales de Figma Make, cada una en un frame con su nombre.
- Diez zonas activas transparentes y diez conexiones de prototipo, entre ellas
  las cinco minimas del Paso 5 y la Tarea C (Leaderboard).
- Nuevo enlace de Figma Prototype (node-id 19-8), verificado sin sesion iniciada.
- Se retira el prototipo HTML: la guia no lo pide. La carpeta 05 pasa a contener
  el mapa de flujo y ENLACES.md.
- El informe ilustra cada pantalla con la salida de Figma Make (26 figuras) y
  documenta que "Copy design" es una funcion del plan Professional.

Pendiente: regenerar los PDF; la exportacion de Word esta colgada en esta maquina.

Co-Authored-By: Claude Opus 5 <noreply@anthropic.com>
</commit_message>
<xml_diff>
--- a/entregables/07_guion_exposicion/Guion_Exposicion_Video_Lab04_EquipoA.docx
+++ b/entregables/07_guion_exposicion/Guion_Exposicion_Video_Lab04_EquipoA.docx
@@ -256,7 +256,24 @@
           <w:color w:val="000000"/>
           <w:sz w:val="24"/>
         </w:rPr>
-        <w:t>El prototipo se muestra siempre desde el navegador, abriendo el archivo «index.html» de la carpeta «05_prototipo_navegable», con la ventana maximizada y el zoom al 100 %.</w:t>
+        <w:t>El prototipo se muestra desde el navegador, con la ventana maximizada y el zoom al 100 %, usando las aplicaciones que generó Figma Make: https://auburn-squid-75629760.figma.site/ para el Dashboard claro, la Watchlist, la Ejecución de órdenes y el Leaderboard; https://scheme-open-12953100.figma.site/ para el Dashboard en modo oscuro; y https://blurry-slab-37286964.figma.site/ para la versión móvil del portafolio. Conviene abrir las tres pestañas antes de empezar a grabar.</w:t>
+      </w:r>
+    </w:p>
+    <w:p>
+      <w:pPr>
+        <w:pStyle w:val="ListBullet"/>
+        <w:spacing w:line="480" w:lineRule="auto" w:before="0" w:after="0"/>
+        <w:ind w:left="720"/>
+      </w:pPr>
+      <w:r>
+        <w:rPr>
+          <w:rFonts w:ascii="Times New Roman" w:hAnsi="Times New Roman" w:eastAsia="Times New Roman"/>
+          <w:b w:val="0"/>
+          <w:i w:val="0"/>
+          <w:color w:val="000000"/>
+          <w:sz w:val="24"/>
+        </w:rPr>
+        <w:t>Cuando el guion menciona el nombre de una pantalla, se refiere a esa misma pantalla dentro de la aplicación de Figma Make que le corresponde.</w:t>
       </w:r>
     </w:p>
     <w:p>
@@ -4652,7 +4669,7 @@
                 <w:color w:val="000000"/>
                 <w:sz w:val="18"/>
               </w:rPr>
-              <w:t>Prototipo en el navegador, archivo «01_dashboard_claro.html». Se recorre con el cursor: barra superior, menú, tarjetas KPI, gráfico, Top Movers y tabla. Al final se pasa el cursor sobre una fila para mostrar el estado de hover.</w:t>
+              <w:t>Prototipo en el navegador, pantalla «Dashboard principal». Se recorre con el cursor: barra superior, menú, tarjetas KPI, gráfico, Top Movers y tabla. Al final se pasa el cursor sobre una fila para mostrar el estado de hover.</w:t>
             </w:r>
           </w:p>
         </w:tc>
@@ -4856,7 +4873,7 @@
                 <w:color w:val="000000"/>
                 <w:sz w:val="18"/>
               </w:rPr>
-              <w:t>Prototipo en «02_watchlist.html». Vista general de la pantalla, sin el modal.</w:t>
+              <w:t>Prototipo en «Watchlist y alertas». Vista general de la pantalla, sin el modal.</w:t>
             </w:r>
           </w:p>
         </w:tc>
@@ -5273,7 +5290,7 @@
                 <w:color w:val="000000"/>
                 <w:sz w:val="18"/>
               </w:rPr>
-              <w:t>Prototipo en «03_trading.html». Vista general. Se sobreimprimen tres rectángulos translúcidos marcando las proporciones 30 / 45 / 25.</w:t>
+              <w:t>Prototipo en «Ejecución de órdenes». Vista general. Se sobreimprimen tres rectángulos translúcidos marcando las proporciones 30 / 45 / 25.</w:t>
             </w:r>
           </w:p>
         </w:tc>
@@ -5758,7 +5775,7 @@
                 <w:color w:val="000000"/>
                 <w:sz w:val="18"/>
               </w:rPr>
-              <w:t>Prototipo en «04_movil_portafolio.html». Se recorre de izquierda a derecha siguiendo las flechas de flujo, deteniéndose unos quince segundos en cada una de las tres vistas.</w:t>
+              <w:t>Prototipo en «Versión móvil del portafolio». Se recorre de izquierda a derecha siguiendo las flechas de flujo, deteniéndose unos quince segundos en cada una de las tres vistas.</w:t>
             </w:r>
           </w:p>
         </w:tc>
@@ -5903,7 +5920,7 @@
                 <w:color w:val="000000"/>
                 <w:sz w:val="18"/>
               </w:rPr>
-              <w:t>Se pulsa el conmutador de tema en el Dashboard claro y se pasa a «05_dashboard_oscuro.html». Zoom sobre la tabla (filas alternadas), sobre el menú lateral y finalmente sobre el conmutador de tema.</w:t>
+              <w:t>Se pulsa el conmutador de tema en el Dashboard claro y se pasa a «Dashboard en modo oscuro». Zoom sobre la tabla (filas alternadas), sobre el menú lateral y finalmente sobre el conmutador de tema.</w:t>
             </w:r>
           </w:p>
         </w:tc>
@@ -6243,7 +6260,7 @@
                 <w:color w:val="000000"/>
                 <w:sz w:val="18"/>
               </w:rPr>
-              <w:t>Prototipo en «06_leaderboard.html». Recorrido: podio, tabla, fila resaltada del usuario y panel derecho. Zoom de tres segundos sobre la fila con la insignia «Tú».</w:t>
+              <w:t>Prototipo en «Leaderboard de la liga». Recorrido: podio, tabla, fila resaltada del usuario y panel derecho. Zoom de tres segundos sobre la fila con la insignia «Tú».</w:t>
             </w:r>
           </w:p>
         </w:tc>
@@ -6320,7 +6337,7 @@
                 <w:color w:val="000000"/>
                 <w:sz w:val="18"/>
               </w:rPr>
-              <w:t>Se recorre el mapa de flujo del archivo «index.html» y se hacen dos o tres saltos reales entre pantallas. Después, Tabla 7 del informe con la comparación wireframe / alta fidelidad.</w:t>
+              <w:t>Se recorre el mapa de flujo del pantalla «mapa de pantallas» y se hacen dos o tres saltos reales entre pantallas. Después, Tabla 7 del informe con la comparación wireframe / alta fidelidad.</w:t>
             </w:r>
           </w:p>
         </w:tc>

</xml_diff>

<commit_message>
Guion de exposicion redistribuido a 10 expositores
Augusto Cerna no participa en el video. Sus dos bloques se reparten:
- La apertura (problema, usuario y agenda) pasa al bloque 1 de Adrian Ccoicca.
- La Tarea D, heuristica 1 de Nielsen, pasa al bloque de Christian Cabrejos,
  donde ya estaba el ejemplo de validacion del formulario de ordenes.
- El prototipo navegable y la comparativa wireframe / alta fidelidad pasan al
  bloque de Rony Grijalva, con las diez conexiones actualizadas.
- La fase del ciclo DCU, las conclusiones y el cierre pasan al bloque de
  Josue Martines.

Diez bloques, uno por expositor, ninguno supera los tres minutos. Total 23:35.

Co-Authored-By: Claude Opus 5 <noreply@anthropic.com>
</commit_message>
<xml_diff>
--- a/entregables/07_guion_exposicion/Guion_Exposicion_Video_Lab04_EquipoA.docx
+++ b/entregables/07_guion_exposicion/Guion_Exposicion_Video_Lab04_EquipoA.docx
@@ -571,7 +571,7 @@
                 <w:color w:val="000000"/>
                 <w:sz w:val="19"/>
               </w:rPr>
-              <w:t>Augusto Nicolás Cerna Sifuentes</w:t>
+              <w:t>Adrián Ccoicca Fernández</w:t>
             </w:r>
           </w:p>
         </w:tc>
@@ -593,7 +593,7 @@
                 <w:color w:val="000000"/>
                 <w:sz w:val="19"/>
               </w:rPr>
-              <w:t>Apertura, problema, usuario y agenda</w:t>
+              <w:t>Apertura, problema, usuario y marco teórico</w:t>
             </w:r>
           </w:p>
         </w:tc>
@@ -615,7 +615,7 @@
                 <w:color w:val="000000"/>
                 <w:sz w:val="19"/>
               </w:rPr>
-              <w:t>1:15</w:t>
+              <w:t>2:45</w:t>
             </w:r>
           </w:p>
         </w:tc>
@@ -640,96 +640,6 @@
                 <w:sz w:val="19"/>
               </w:rPr>
               <w:t>2</w:t>
-            </w:r>
-          </w:p>
-        </w:tc>
-        <w:tc>
-          <w:tcPr>
-            <w:tcW w:type="dxa" w:w="3061"/>
-          </w:tcPr>
-          <w:p>
-            <w:pPr>
-              <w:spacing w:line="240" w:lineRule="auto" w:before="40" w:after="40"/>
-              <w:jc w:val="left"/>
-            </w:pPr>
-            <w:r/>
-            <w:r>
-              <w:rPr>
-                <w:rFonts w:ascii="Times New Roman" w:hAnsi="Times New Roman" w:eastAsia="Times New Roman"/>
-                <w:b w:val="0"/>
-                <w:i w:val="0"/>
-                <w:color w:val="000000"/>
-                <w:sz w:val="19"/>
-              </w:rPr>
-              <w:t>Adrián Ccoicca Fernández</w:t>
-            </w:r>
-          </w:p>
-        </w:tc>
-        <w:tc>
-          <w:tcPr>
-            <w:tcW w:type="dxa" w:w="3969"/>
-          </w:tcPr>
-          <w:p>
-            <w:pPr>
-              <w:spacing w:line="240" w:lineRule="auto" w:before="40" w:after="40"/>
-              <w:jc w:val="left"/>
-            </w:pPr>
-            <w:r/>
-            <w:r>
-              <w:rPr>
-                <w:rFonts w:ascii="Times New Roman" w:hAnsi="Times New Roman" w:eastAsia="Times New Roman"/>
-                <w:b w:val="0"/>
-                <w:i w:val="0"/>
-                <w:color w:val="000000"/>
-                <w:sz w:val="19"/>
-              </w:rPr>
-              <w:t>Marco teórico: prototipos y ciclo DCU</w:t>
-            </w:r>
-          </w:p>
-        </w:tc>
-        <w:tc>
-          <w:tcPr>
-            <w:tcW w:type="dxa" w:w="1134"/>
-          </w:tcPr>
-          <w:p>
-            <w:pPr>
-              <w:spacing w:line="240" w:lineRule="auto" w:before="40" w:after="40"/>
-              <w:jc w:val="left"/>
-            </w:pPr>
-            <w:r/>
-            <w:r>
-              <w:rPr>
-                <w:rFonts w:ascii="Times New Roman" w:hAnsi="Times New Roman" w:eastAsia="Times New Roman"/>
-                <w:b w:val="0"/>
-                <w:i w:val="0"/>
-                <w:color w:val="000000"/>
-                <w:sz w:val="19"/>
-              </w:rPr>
-              <w:t>2:00</w:t>
-            </w:r>
-          </w:p>
-        </w:tc>
-      </w:tr>
-      <w:tr>
-        <w:tc>
-          <w:tcPr>
-            <w:tcW w:type="dxa" w:w="907"/>
-          </w:tcPr>
-          <w:p>
-            <w:pPr>
-              <w:spacing w:line="240" w:lineRule="auto" w:before="40" w:after="40"/>
-              <w:jc w:val="left"/>
-            </w:pPr>
-            <w:r/>
-            <w:r>
-              <w:rPr>
-                <w:rFonts w:ascii="Times New Roman" w:hAnsi="Times New Roman" w:eastAsia="Times New Roman"/>
-                <w:b w:val="0"/>
-                <w:i w:val="0"/>
-                <w:color w:val="000000"/>
-                <w:sz w:val="19"/>
-              </w:rPr>
-              <w:t>3</w:t>
             </w:r>
           </w:p>
         </w:tc>
@@ -819,7 +729,7 @@
                 <w:color w:val="000000"/>
                 <w:sz w:val="19"/>
               </w:rPr>
-              <w:t>4</w:t>
+              <w:t>3</w:t>
             </w:r>
           </w:p>
         </w:tc>
@@ -909,7 +819,7 @@
                 <w:color w:val="000000"/>
                 <w:sz w:val="19"/>
               </w:rPr>
-              <w:t>5</w:t>
+              <w:t>4</w:t>
             </w:r>
           </w:p>
         </w:tc>
@@ -999,7 +909,7 @@
                 <w:color w:val="000000"/>
                 <w:sz w:val="19"/>
               </w:rPr>
-              <w:t>6</w:t>
+              <w:t>5</w:t>
             </w:r>
           </w:p>
         </w:tc>
@@ -1089,7 +999,7 @@
                 <w:color w:val="000000"/>
                 <w:sz w:val="19"/>
               </w:rPr>
-              <w:t>7</w:t>
+              <w:t>6</w:t>
             </w:r>
           </w:p>
         </w:tc>
@@ -1179,7 +1089,7 @@
                 <w:color w:val="000000"/>
                 <w:sz w:val="19"/>
               </w:rPr>
-              <w:t>8</w:t>
+              <w:t>7</w:t>
             </w:r>
           </w:p>
         </w:tc>
@@ -1269,7 +1179,7 @@
                 <w:color w:val="000000"/>
                 <w:sz w:val="19"/>
               </w:rPr>
-              <w:t>9</w:t>
+              <w:t>8</w:t>
             </w:r>
           </w:p>
         </w:tc>
@@ -1313,7 +1223,7 @@
                 <w:color w:val="000000"/>
                 <w:sz w:val="19"/>
               </w:rPr>
-              <w:t>Pantalla 3: ejecución de órdenes</w:t>
+              <w:t>Pantalla 3: órdenes y discusión de usabilidad (Tarea D)</w:t>
             </w:r>
           </w:p>
         </w:tc>
@@ -1335,7 +1245,97 @@
                 <w:color w:val="000000"/>
                 <w:sz w:val="19"/>
               </w:rPr>
-              <w:t>2:00</w:t>
+              <w:t>2:45</w:t>
+            </w:r>
+          </w:p>
+        </w:tc>
+      </w:tr>
+      <w:tr>
+        <w:tc>
+          <w:tcPr>
+            <w:tcW w:type="dxa" w:w="907"/>
+          </w:tcPr>
+          <w:p>
+            <w:pPr>
+              <w:spacing w:line="240" w:lineRule="auto" w:before="40" w:after="40"/>
+              <w:jc w:val="left"/>
+            </w:pPr>
+            <w:r/>
+            <w:r>
+              <w:rPr>
+                <w:rFonts w:ascii="Times New Roman" w:hAnsi="Times New Roman" w:eastAsia="Times New Roman"/>
+                <w:b w:val="0"/>
+                <w:i w:val="0"/>
+                <w:color w:val="000000"/>
+                <w:sz w:val="19"/>
+              </w:rPr>
+              <w:t>9</w:t>
+            </w:r>
+          </w:p>
+        </w:tc>
+        <w:tc>
+          <w:tcPr>
+            <w:tcW w:type="dxa" w:w="3061"/>
+          </w:tcPr>
+          <w:p>
+            <w:pPr>
+              <w:spacing w:line="240" w:lineRule="auto" w:before="40" w:after="40"/>
+              <w:jc w:val="left"/>
+            </w:pPr>
+            <w:r/>
+            <w:r>
+              <w:rPr>
+                <w:rFonts w:ascii="Times New Roman" w:hAnsi="Times New Roman" w:eastAsia="Times New Roman"/>
+                <w:b w:val="0"/>
+                <w:i w:val="0"/>
+                <w:color w:val="000000"/>
+                <w:sz w:val="19"/>
+              </w:rPr>
+              <w:t>Rony Smith Grijalva De La Cruz</w:t>
+            </w:r>
+          </w:p>
+        </w:tc>
+        <w:tc>
+          <w:tcPr>
+            <w:tcW w:type="dxa" w:w="3969"/>
+          </w:tcPr>
+          <w:p>
+            <w:pPr>
+              <w:spacing w:line="240" w:lineRule="auto" w:before="40" w:after="40"/>
+              <w:jc w:val="left"/>
+            </w:pPr>
+            <w:r/>
+            <w:r>
+              <w:rPr>
+                <w:rFonts w:ascii="Times New Roman" w:hAnsi="Times New Roman" w:eastAsia="Times New Roman"/>
+                <w:b w:val="0"/>
+                <w:i w:val="0"/>
+                <w:color w:val="000000"/>
+                <w:sz w:val="19"/>
+              </w:rPr>
+              <w:t>Pantallas 4 y 5, prototipo navegable y comparativa</w:t>
+            </w:r>
+          </w:p>
+        </w:tc>
+        <w:tc>
+          <w:tcPr>
+            <w:tcW w:type="dxa" w:w="1134"/>
+          </w:tcPr>
+          <w:p>
+            <w:pPr>
+              <w:spacing w:line="240" w:lineRule="auto" w:before="40" w:after="40"/>
+              <w:jc w:val="left"/>
+            </w:pPr>
+            <w:r/>
+            <w:r>
+              <w:rPr>
+                <w:rFonts w:ascii="Times New Roman" w:hAnsi="Times New Roman" w:eastAsia="Times New Roman"/>
+                <w:b w:val="0"/>
+                <w:i w:val="0"/>
+                <w:color w:val="000000"/>
+                <w:sz w:val="19"/>
+              </w:rPr>
+              <w:t>3:00</w:t>
             </w:r>
           </w:p>
         </w:tc>
@@ -1381,96 +1381,6 @@
                 <w:color w:val="000000"/>
                 <w:sz w:val="19"/>
               </w:rPr>
-              <w:t>Rony Smith Grijalva De La Cruz</w:t>
-            </w:r>
-          </w:p>
-        </w:tc>
-        <w:tc>
-          <w:tcPr>
-            <w:tcW w:type="dxa" w:w="3969"/>
-          </w:tcPr>
-          <w:p>
-            <w:pPr>
-              <w:spacing w:line="240" w:lineRule="auto" w:before="40" w:after="40"/>
-              <w:jc w:val="left"/>
-            </w:pPr>
-            <w:r/>
-            <w:r>
-              <w:rPr>
-                <w:rFonts w:ascii="Times New Roman" w:hAnsi="Times New Roman" w:eastAsia="Times New Roman"/>
-                <w:b w:val="0"/>
-                <w:i w:val="0"/>
-                <w:color w:val="000000"/>
-                <w:sz w:val="19"/>
-              </w:rPr>
-              <w:t>Pantallas 4 y 5: versión móvil y modo oscuro</w:t>
-            </w:r>
-          </w:p>
-        </w:tc>
-        <w:tc>
-          <w:tcPr>
-            <w:tcW w:type="dxa" w:w="1134"/>
-          </w:tcPr>
-          <w:p>
-            <w:pPr>
-              <w:spacing w:line="240" w:lineRule="auto" w:before="40" w:after="40"/>
-              <w:jc w:val="left"/>
-            </w:pPr>
-            <w:r/>
-            <w:r>
-              <w:rPr>
-                <w:rFonts w:ascii="Times New Roman" w:hAnsi="Times New Roman" w:eastAsia="Times New Roman"/>
-                <w:b w:val="0"/>
-                <w:i w:val="0"/>
-                <w:color w:val="000000"/>
-                <w:sz w:val="19"/>
-              </w:rPr>
-              <w:t>2:15</w:t>
-            </w:r>
-          </w:p>
-        </w:tc>
-      </w:tr>
-      <w:tr>
-        <w:tc>
-          <w:tcPr>
-            <w:tcW w:type="dxa" w:w="907"/>
-          </w:tcPr>
-          <w:p>
-            <w:pPr>
-              <w:spacing w:line="240" w:lineRule="auto" w:before="40" w:after="40"/>
-              <w:jc w:val="left"/>
-            </w:pPr>
-            <w:r/>
-            <w:r>
-              <w:rPr>
-                <w:rFonts w:ascii="Times New Roman" w:hAnsi="Times New Roman" w:eastAsia="Times New Roman"/>
-                <w:b w:val="0"/>
-                <w:i w:val="0"/>
-                <w:color w:val="000000"/>
-                <w:sz w:val="19"/>
-              </w:rPr>
-              <w:t>11</w:t>
-            </w:r>
-          </w:p>
-        </w:tc>
-        <w:tc>
-          <w:tcPr>
-            <w:tcW w:type="dxa" w:w="3061"/>
-          </w:tcPr>
-          <w:p>
-            <w:pPr>
-              <w:spacing w:line="240" w:lineRule="auto" w:before="40" w:after="40"/>
-              <w:jc w:val="left"/>
-            </w:pPr>
-            <w:r/>
-            <w:r>
-              <w:rPr>
-                <w:rFonts w:ascii="Times New Roman" w:hAnsi="Times New Roman" w:eastAsia="Times New Roman"/>
-                <w:b w:val="0"/>
-                <w:i w:val="0"/>
-                <w:color w:val="000000"/>
-                <w:sz w:val="19"/>
-              </w:rPr>
               <w:t>Josué Martines Cancho</w:t>
             </w:r>
           </w:p>
@@ -1493,7 +1403,7 @@
                 <w:color w:val="000000"/>
                 <w:sz w:val="19"/>
               </w:rPr>
-              <w:t>Pantalla 6: Leaderboard y prototipo navegable</w:t>
+              <w:t>Pantalla 6: Leaderboard, fase del ciclo DCU y cierre</w:t>
             </w:r>
           </w:p>
         </w:tc>
@@ -1515,97 +1425,7 @@
                 <w:color w:val="000000"/>
                 <w:sz w:val="19"/>
               </w:rPr>
-              <w:t>2:15</w:t>
-            </w:r>
-          </w:p>
-        </w:tc>
-      </w:tr>
-      <w:tr>
-        <w:tc>
-          <w:tcPr>
-            <w:tcW w:type="dxa" w:w="907"/>
-          </w:tcPr>
-          <w:p>
-            <w:pPr>
-              <w:spacing w:line="240" w:lineRule="auto" w:before="40" w:after="40"/>
-              <w:jc w:val="left"/>
-            </w:pPr>
-            <w:r/>
-            <w:r>
-              <w:rPr>
-                <w:rFonts w:ascii="Times New Roman" w:hAnsi="Times New Roman" w:eastAsia="Times New Roman"/>
-                <w:b w:val="0"/>
-                <w:i w:val="0"/>
-                <w:color w:val="000000"/>
-                <w:sz w:val="19"/>
-              </w:rPr>
-              <w:t>12</w:t>
-            </w:r>
-          </w:p>
-        </w:tc>
-        <w:tc>
-          <w:tcPr>
-            <w:tcW w:type="dxa" w:w="3061"/>
-          </w:tcPr>
-          <w:p>
-            <w:pPr>
-              <w:spacing w:line="240" w:lineRule="auto" w:before="40" w:after="40"/>
-              <w:jc w:val="left"/>
-            </w:pPr>
-            <w:r/>
-            <w:r>
-              <w:rPr>
-                <w:rFonts w:ascii="Times New Roman" w:hAnsi="Times New Roman" w:eastAsia="Times New Roman"/>
-                <w:b w:val="0"/>
-                <w:i w:val="0"/>
-                <w:color w:val="000000"/>
-                <w:sz w:val="19"/>
-              </w:rPr>
-              <w:t>Augusto Nicolás Cerna Sifuentes</w:t>
-            </w:r>
-          </w:p>
-        </w:tc>
-        <w:tc>
-          <w:tcPr>
-            <w:tcW w:type="dxa" w:w="3969"/>
-          </w:tcPr>
-          <w:p>
-            <w:pPr>
-              <w:spacing w:line="240" w:lineRule="auto" w:before="40" w:after="40"/>
-              <w:jc w:val="left"/>
-            </w:pPr>
-            <w:r/>
-            <w:r>
-              <w:rPr>
-                <w:rFonts w:ascii="Times New Roman" w:hAnsi="Times New Roman" w:eastAsia="Times New Roman"/>
-                <w:b w:val="0"/>
-                <w:i w:val="0"/>
-                <w:color w:val="000000"/>
-                <w:sz w:val="19"/>
-              </w:rPr>
-              <w:t>Discusión de usabilidad, conclusiones y cierre</w:t>
-            </w:r>
-          </w:p>
-        </w:tc>
-        <w:tc>
-          <w:tcPr>
-            <w:tcW w:type="dxa" w:w="1134"/>
-          </w:tcPr>
-          <w:p>
-            <w:pPr>
-              <w:spacing w:line="240" w:lineRule="auto" w:before="40" w:after="40"/>
-              <w:jc w:val="left"/>
-            </w:pPr>
-            <w:r/>
-            <w:r>
-              <w:rPr>
-                <w:rFonts w:ascii="Times New Roman" w:hAnsi="Times New Roman" w:eastAsia="Times New Roman"/>
-                <w:b w:val="0"/>
-                <w:i w:val="0"/>
-                <w:color w:val="000000"/>
-                <w:sz w:val="19"/>
-              </w:rPr>
-              <w:t>1:45</w:t>
+              <w:t>2:50</w:t>
             </w:r>
           </w:p>
         </w:tc>
@@ -1705,7 +1525,7 @@
                 <w:color w:val="000000"/>
                 <w:sz w:val="19"/>
               </w:rPr>
-              <w:t>23:45</w:t>
+              <w:t>23:35</w:t>
             </w:r>
           </w:p>
         </w:tc>
@@ -1735,7 +1555,7 @@
           <w:color w:val="000000"/>
           <w:sz w:val="19"/>
         </w:rPr>
-        <w:t>Ningún integrante supera los tres minutos de exposición. Los bloques 1 y 12 corresponden a la misma persona y suman 3:00 en total.</w:t>
+        <w:t>Cada integrante expone un único bloque y ninguno alcanza los tres minutos que fija el enunciado. Augusto Nicolás Cerna Sifuentes, que coordinó el trabajo, no interviene en el vídeo; sus dos bloques originales se repartieron entre la apertura del bloque 1 y el cierre del bloque 10.</w:t>
       </w:r>
     </w:p>
     <w:p>
@@ -1771,7 +1591,7 @@
           <w:color w:val="1F3864"/>
           <w:sz w:val="24"/>
         </w:rPr>
-        <w:t>Bloque 1 · Augusto Nicolás Cerna Sifuentes</w:t>
+        <w:t>Bloque 1 · Adrián Ccoicca Fernández</w:t>
       </w:r>
     </w:p>
     <w:p>
@@ -1788,7 +1608,7 @@
           <w:color w:val="000000"/>
           <w:sz w:val="21"/>
         </w:rPr>
-        <w:t>Código 24200053 · Tema: Apertura, problema, usuario y agenda · Duración prevista: 1 min 15 s</w:t>
+        <w:t>Código 24200154 · Tema: Apertura, problema, usuario y marco teórico · Duración prevista: 2 min 45 s</w:t>
       </w:r>
     </w:p>
     <w:tbl>
@@ -1910,7 +1730,7 @@
                 <w:color w:val="000000"/>
                 <w:sz w:val="18"/>
               </w:rPr>
-              <w:t>0:00 – 0:20</w:t>
+              <w:t>0:00 – 0:15</w:t>
             </w:r>
           </w:p>
         </w:tc>
@@ -1932,7 +1752,7 @@
                 <w:color w:val="000000"/>
                 <w:sz w:val="19"/>
               </w:rPr>
-              <w:t>Buenas tardes, profesor Cancho-Rodríguez y compañeros. Soy Augusto Nicolás Cerna Sifuentes y, en nombre del Equipo A, presento el trabajo del Laboratorio 04: el prototipado de interfaces para un dashboard bursátil llamado «Ernesto Investing AI».</w:t>
+              <w:t>Buenas tardes, profesor Cancho-Rodríguez y compañeros. Soy Adrián Ccoicca Fernández y, en nombre del Equipo A, presento el trabajo del Laboratorio 04: el prototipado de interfaces para un dashboard bursátil llamado «Ernesto Investing AI».</w:t>
             </w:r>
           </w:p>
         </w:tc>
@@ -1978,7 +1798,7 @@
                 <w:color w:val="000000"/>
                 <w:sz w:val="18"/>
               </w:rPr>
-              <w:t>0:20 – 0:45</w:t>
+              <w:t>0:15 – 0:35</w:t>
             </w:r>
           </w:p>
         </w:tc>
@@ -2046,7 +1866,7 @@
                 <w:color w:val="000000"/>
                 <w:sz w:val="18"/>
               </w:rPr>
-              <w:t>0:45 – 1:05</w:t>
+              <w:t>0:35 – 0:45</w:t>
             </w:r>
           </w:p>
         </w:tc>
@@ -2068,7 +1888,7 @@
                 <w:color w:val="000000"/>
                 <w:sz w:val="19"/>
               </w:rPr>
-              <w:t>Para resolverlo recorrimos la escalera completa de fidelidad: analizamos cuatro plataformas reales, dibujamos once bocetos en papel, construimos un wireframe en PlantUML Salt y generamos seis pantallas de alta fidelidad con prompts hiperdetallados, que después conectamos en un prototipo navegable.</w:t>
+              <w:t>Para resolverlo recorrimos la escalera completa de fidelidad: cuatro plataformas analizadas, once bocetos en papel, un wireframe en PlantUML Salt y seis pantallas de alta fidelidad generadas con prompts hiperdetallados y conectadas en un prototipo navegable. Una precisión antes de empezar: todas las cifras que verán son simuladas y tienen fines didácticos.</w:t>
             </w:r>
           </w:p>
         </w:tc>
@@ -2090,220 +1910,7 @@
                 <w:color w:val="000000"/>
                 <w:sz w:val="18"/>
               </w:rPr>
-              <w:t>Diagrama de la agenda en cuatro pasos, con iconos: lupa (análisis), lápiz (boceto), cuadrícula (wireframe) y pantalla (alta fidelidad). Cada paso se resalta al nombrarlo.</w:t>
-            </w:r>
-          </w:p>
-        </w:tc>
-      </w:tr>
-      <w:tr>
-        <w:tc>
-          <w:tcPr>
-            <w:tcW w:type="dxa" w:w="1077"/>
-            <w:tcBorders>
-              <w:bottom w:val="single" w:sz="6" w:space="0" w:color="000000"/>
-            </w:tcBorders>
-          </w:tcPr>
-          <w:p>
-            <w:pPr>
-              <w:spacing w:line="240" w:lineRule="auto" w:before="80" w:after="80"/>
-              <w:jc w:val="left"/>
-            </w:pPr>
-            <w:r/>
-            <w:r>
-              <w:rPr>
-                <w:rFonts w:ascii="Times New Roman" w:hAnsi="Times New Roman" w:eastAsia="Times New Roman"/>
-                <w:b w:val="0"/>
-                <w:i w:val="0"/>
-                <w:color w:val="000000"/>
-                <w:sz w:val="18"/>
-              </w:rPr>
-              <w:t>1:05 – 1:15</w:t>
-            </w:r>
-          </w:p>
-        </w:tc>
-        <w:tc>
-          <w:tcPr>
-            <w:tcW w:type="dxa" w:w="4989"/>
-            <w:tcBorders>
-              <w:bottom w:val="single" w:sz="6" w:space="0" w:color="000000"/>
-            </w:tcBorders>
-          </w:tcPr>
-          <w:p>
-            <w:pPr>
-              <w:spacing w:line="240" w:lineRule="auto" w:before="80" w:after="80"/>
-              <w:jc w:val="left"/>
-            </w:pPr>
-            <w:r/>
-            <w:r>
-              <w:rPr>
-                <w:rFonts w:ascii="Times New Roman" w:hAnsi="Times New Roman" w:eastAsia="Times New Roman"/>
-                <w:b w:val="0"/>
-                <w:i w:val="0"/>
-                <w:color w:val="000000"/>
-                <w:sz w:val="19"/>
-              </w:rPr>
-              <w:t>Una precisión importante antes de empezar: todas las cifras que verán en el prototipo son simuladas y tienen fines didácticos; no constituyen información financiera real. Continúa Adrián Ccoicca con el marco teórico.</w:t>
-            </w:r>
-          </w:p>
-        </w:tc>
-        <w:tc>
-          <w:tcPr>
-            <w:tcW w:type="dxa" w:w="3005"/>
-            <w:tcBorders>
-              <w:bottom w:val="single" w:sz="6" w:space="0" w:color="000000"/>
-            </w:tcBorders>
-          </w:tcPr>
-          <w:p>
-            <w:pPr>
-              <w:spacing w:line="240" w:lineRule="auto" w:before="80" w:after="80"/>
-              <w:jc w:val="left"/>
-            </w:pPr>
-            <w:r/>
-            <w:r>
-              <w:rPr>
-                <w:rFonts w:ascii="Times New Roman" w:hAnsi="Times New Roman" w:eastAsia="Times New Roman"/>
-                <w:b w:val="0"/>
-                <w:i/>
-                <w:color w:val="000000"/>
-                <w:sz w:val="18"/>
-              </w:rPr>
-              <w:t>Rótulo sobreimpreso en la parte inferior: «Datos simulados con fines académicos». Fundido a negro de medio segundo.</w:t>
-            </w:r>
-          </w:p>
-        </w:tc>
-      </w:tr>
-    </w:tbl>
-    <w:p>
-      <w:pPr>
-        <w:pageBreakBefore/>
-        <w:spacing w:line="480" w:lineRule="auto" w:before="280" w:after="0"/>
-        <w:ind w:firstLine="0"/>
-        <w:jc w:val="left"/>
-      </w:pPr>
-      <w:r>
-        <w:rPr>
-          <w:rFonts w:ascii="Times New Roman" w:hAnsi="Times New Roman" w:eastAsia="Times New Roman"/>
-          <w:b/>
-          <w:i w:val="0"/>
-          <w:color w:val="1F3864"/>
-          <w:sz w:val="24"/>
-        </w:rPr>
-        <w:t>Bloque 2 · Adrián Ccoicca Fernández</w:t>
-      </w:r>
-    </w:p>
-    <w:p>
-      <w:pPr>
-        <w:spacing w:line="240" w:lineRule="auto" w:before="0" w:after="80"/>
-        <w:ind w:firstLine="0"/>
-        <w:jc w:val="left"/>
-      </w:pPr>
-      <w:r>
-        <w:rPr>
-          <w:rFonts w:ascii="Times New Roman" w:hAnsi="Times New Roman" w:eastAsia="Times New Roman"/>
-          <w:b w:val="0"/>
-          <w:i/>
-          <w:color w:val="000000"/>
-          <w:sz w:val="21"/>
-        </w:rPr>
-        <w:t>Código 24200154 · Tema: Marco teórico: prototipos y ciclo de diseño centrado en el usuario · Duración prevista: 2 min</w:t>
-      </w:r>
-    </w:p>
-    <w:tbl>
-      <w:tblPr>
-        <w:tblW w:type="auto" w:w="0"/>
-        <w:tblLayout w:type="fixed"/>
-        <w:tblLook w:firstColumn="1" w:firstRow="1" w:lastColumn="0" w:lastRow="0" w:noHBand="0" w:noVBand="1" w:val="04A0"/>
-      </w:tblPr>
-      <w:tblGrid>
-        <w:gridCol w:w="3120"/>
-        <w:gridCol w:w="3120"/>
-        <w:gridCol w:w="3120"/>
-      </w:tblGrid>
-      <w:tr>
-        <w:tc>
-          <w:tcPr>
-            <w:tcW w:type="dxa" w:w="1077"/>
-            <w:tcBorders>
-              <w:top w:val="single" w:sz="6" w:space="0" w:color="000000"/>
-              <w:left w:val="none" w:sz="0"/>
-              <w:bottom w:val="single" w:sz="6" w:space="0" w:color="000000"/>
-              <w:right w:val="none" w:sz="0"/>
-              <w:insideH w:val="none" w:sz="0"/>
-              <w:insideV w:val="none" w:sz="0"/>
-            </w:tcBorders>
-          </w:tcPr>
-          <w:p>
-            <w:pPr>
-              <w:spacing w:line="240" w:lineRule="auto" w:before="60" w:after="60"/>
-            </w:pPr>
-            <w:r/>
-            <w:r>
-              <w:rPr>
-                <w:rFonts w:ascii="Times New Roman" w:hAnsi="Times New Roman" w:eastAsia="Times New Roman"/>
-                <w:b/>
-                <w:i w:val="0"/>
-                <w:color w:val="000000"/>
-                <w:sz w:val="19"/>
-              </w:rPr>
-              <w:t>Tiempo</w:t>
-            </w:r>
-          </w:p>
-        </w:tc>
-        <w:tc>
-          <w:tcPr>
-            <w:tcW w:type="dxa" w:w="4989"/>
-            <w:tcBorders>
-              <w:top w:val="single" w:sz="6" w:space="0" w:color="000000"/>
-              <w:left w:val="none" w:sz="0"/>
-              <w:bottom w:val="single" w:sz="6" w:space="0" w:color="000000"/>
-              <w:right w:val="none" w:sz="0"/>
-              <w:insideH w:val="none" w:sz="0"/>
-              <w:insideV w:val="none" w:sz="0"/>
-            </w:tcBorders>
-          </w:tcPr>
-          <w:p>
-            <w:pPr>
-              <w:spacing w:line="240" w:lineRule="auto" w:before="60" w:after="60"/>
-            </w:pPr>
-            <w:r/>
-            <w:r>
-              <w:rPr>
-                <w:rFonts w:ascii="Times New Roman" w:hAnsi="Times New Roman" w:eastAsia="Times New Roman"/>
-                <w:b/>
-                <w:i w:val="0"/>
-                <w:color w:val="000000"/>
-                <w:sz w:val="19"/>
-              </w:rPr>
-              <w:t>Guion (lo que se dice)</w:t>
-            </w:r>
-          </w:p>
-        </w:tc>
-        <w:tc>
-          <w:tcPr>
-            <w:tcW w:type="dxa" w:w="3005"/>
-            <w:tcBorders>
-              <w:top w:val="single" w:sz="6" w:space="0" w:color="000000"/>
-              <w:left w:val="none" w:sz="0"/>
-              <w:bottom w:val="single" w:sz="6" w:space="0" w:color="000000"/>
-              <w:right w:val="none" w:sz="0"/>
-              <w:insideH w:val="none" w:sz="0"/>
-              <w:insideV w:val="none" w:sz="0"/>
-            </w:tcBorders>
-          </w:tcPr>
-          <w:p>
-            <w:pPr>
-              <w:spacing w:line="240" w:lineRule="auto" w:before="60" w:after="60"/>
-            </w:pPr>
-            <w:r/>
-            <w:r>
-              <w:rPr>
-                <w:rFonts w:ascii="Times New Roman" w:hAnsi="Times New Roman" w:eastAsia="Times New Roman"/>
-                <w:b/>
-                <w:i w:val="0"/>
-                <w:color w:val="000000"/>
-                <w:sz w:val="19"/>
-              </w:rPr>
-              <w:t>En pantalla (lo que se muestra)</w:t>
+              <w:t>Diagrama de la agenda en cuatro pasos, con iconos: lupa, lápiz, cuadrícula y pantalla. Rótulo inferior: «Datos simulados con fines académicos».</w:t>
             </w:r>
           </w:p>
         </w:tc>
@@ -2327,7 +1934,7 @@
                 <w:color w:val="000000"/>
                 <w:sz w:val="18"/>
               </w:rPr>
-              <w:t>0:00 – 0:25</w:t>
+              <w:t>0:45 – 1:10</w:t>
             </w:r>
           </w:p>
         </w:tc>
@@ -2349,7 +1956,7 @@
                 <w:color w:val="000000"/>
                 <w:sz w:val="19"/>
               </w:rPr>
-              <w:t>Soy Adrián Ccoicca Fernández. Empecemos por la definición. Un prototipo es una representación limitada de un sistema interactivo que permite explorar su conveniencia antes de implementarlo. La palabra clave es «limitada»: el prototipo se construye para responder una pregunta concreta de diseño y se descarta cuando ya la respondió.</w:t>
+              <w:t>Empecemos por la definición. Un prototipo es una representación limitada de un sistema interactivo que permite explorar su conveniencia antes de implementarlo. La palabra clave es «limitada»: el prototipo se construye para responder una pregunta concreta de diseño y se descarta cuando ya la respondió.</w:t>
             </w:r>
           </w:p>
         </w:tc>
@@ -2395,7 +2002,7 @@
                 <w:color w:val="000000"/>
                 <w:sz w:val="18"/>
               </w:rPr>
-              <w:t>0:25 – 0:55</w:t>
+              <w:t>1:10 – 1:40</w:t>
             </w:r>
           </w:p>
         </w:tc>
@@ -2463,7 +2070,7 @@
                 <w:color w:val="000000"/>
                 <w:sz w:val="18"/>
               </w:rPr>
-              <w:t>0:55 – 1:25</w:t>
+              <w:t>1:40 – 2:10</w:t>
             </w:r>
           </w:p>
         </w:tc>
@@ -2534,7 +2141,7 @@
                 <w:color w:val="000000"/>
                 <w:sz w:val="18"/>
               </w:rPr>
-              <w:t>1:25 – 2:00</w:t>
+              <w:t>2:10 – 2:45</w:t>
             </w:r>
           </w:p>
         </w:tc>
@@ -2605,7 +2212,7 @@
           <w:color w:val="1F3864"/>
           <w:sz w:val="24"/>
         </w:rPr>
-        <w:t>Bloque 3 · Diana Carolina Postigo Vega</w:t>
+        <w:t>Bloque 2 · Diana Carolina Postigo Vega</w:t>
       </w:r>
     </w:p>
     <w:p>
@@ -3022,7 +2629,7 @@
           <w:color w:val="1F3864"/>
           <w:sz w:val="24"/>
         </w:rPr>
-        <w:t>Bloque 4 · Ericka Sofía Arboleda Sánchez</w:t>
+        <w:t>Bloque 3 · Ericka Sofía Arboleda Sánchez</w:t>
       </w:r>
     </w:p>
     <w:p>
@@ -3439,7 +3046,7 @@
           <w:color w:val="1F3864"/>
           <w:sz w:val="24"/>
         </w:rPr>
-        <w:t>Bloque 5 · Katherine Lizbeth Siesquen Torres</w:t>
+        <w:t>Bloque 4 · Katherine Lizbeth Siesquen Torres</w:t>
       </w:r>
     </w:p>
     <w:p>
@@ -3856,7 +3463,7 @@
           <w:color w:val="1F3864"/>
           <w:sz w:val="24"/>
         </w:rPr>
-        <w:t>Bloque 6 · Jean Carlo Tecsi Alanoca</w:t>
+        <w:t>Bloque 5 · Jean Carlo Tecsi Alanoca</w:t>
       </w:r>
     </w:p>
     <w:p>
@@ -4273,7 +3880,7 @@
           <w:color w:val="1F3864"/>
           <w:sz w:val="24"/>
         </w:rPr>
-        <w:t>Bloque 7 · María Sunori Tonconi Isidro</w:t>
+        <w:t>Bloque 6 · María Sunori Tonconi Isidro</w:t>
       </w:r>
     </w:p>
     <w:p>
@@ -4690,7 +4297,7 @@
           <w:color w:val="1F3864"/>
           <w:sz w:val="24"/>
         </w:rPr>
-        <w:t>Bloque 8 · Marco Antonio Villegas Niño</w:t>
+        <w:t>Bloque 7 · Marco Antonio Villegas Niño</w:t>
       </w:r>
     </w:p>
     <w:p>
@@ -5107,7 +4714,7 @@
           <w:color w:val="1F3864"/>
           <w:sz w:val="24"/>
         </w:rPr>
-        <w:t>Bloque 9 · Christian Daniel Cabrejos Palomino</w:t>
+        <w:t>Bloque 8 · Christian Daniel Cabrejos Palomino</w:t>
       </w:r>
     </w:p>
     <w:p>
@@ -5124,7 +4731,7 @@
           <w:color w:val="000000"/>
           <w:sz w:val="21"/>
         </w:rPr>
-        <w:t>Código 23200242 · Tema: Pantalla 3: ejecución de órdenes y validación en tiempo real · Duración prevista: 2 min</w:t>
+        <w:t>Código 23200242 · Tema: Pantalla 3: ejecución de órdenes y discusión de usabilidad (Tarea D) · Duración prevista: 2 min 45 s</w:t>
       </w:r>
     </w:p>
     <w:tbl>
@@ -5435,6 +5042,74 @@
         <w:tc>
           <w:tcPr>
             <w:tcW w:type="dxa" w:w="1077"/>
+          </w:tcPr>
+          <w:p>
+            <w:pPr>
+              <w:spacing w:line="240" w:lineRule="auto" w:before="80" w:after="80"/>
+              <w:jc w:val="left"/>
+            </w:pPr>
+            <w:r/>
+            <w:r>
+              <w:rPr>
+                <w:rFonts w:ascii="Times New Roman" w:hAnsi="Times New Roman" w:eastAsia="Times New Roman"/>
+                <w:b w:val="0"/>
+                <w:i w:val="0"/>
+                <w:color w:val="000000"/>
+                <w:sz w:val="18"/>
+              </w:rPr>
+              <w:t>1:25 – 2:00</w:t>
+            </w:r>
+          </w:p>
+        </w:tc>
+        <w:tc>
+          <w:tcPr>
+            <w:tcW w:type="dxa" w:w="4989"/>
+          </w:tcPr>
+          <w:p>
+            <w:pPr>
+              <w:spacing w:line="240" w:lineRule="auto" w:before="80" w:after="80"/>
+              <w:jc w:val="left"/>
+            </w:pPr>
+            <w:r/>
+            <w:r>
+              <w:rPr>
+                <w:rFonts w:ascii="Times New Roman" w:hAnsi="Times New Roman" w:eastAsia="Times New Roman"/>
+                <w:b w:val="0"/>
+                <w:i w:val="0"/>
+                <w:color w:val="000000"/>
+                <w:sz w:val="19"/>
+              </w:rPr>
+              <w:t>Y la columna derecha es la que más nos interesa mostrar. Tiene el formulario de orden con pestañas de compra y venta, tipo de orden, precio límite, cantidad con botones de porcentaje del poder de compra, y el resumen de costos. Lo importante está aquí: hemos introducido cinco mil doscientas acciones, que exceden el poder de compra disponible, y la interfaz lo advierte en rojo antes de que el usuario pulse ejecutar, cuantifica el exceso en cinco mil seiscientos ochenta dólares y propone la cantidad máxima admisible. Eso es prevención de errores y ayuda a la recuperación, dos heurísticas de Nielsen aplicadas en un solo control.</w:t>
+            </w:r>
+          </w:p>
+        </w:tc>
+        <w:tc>
+          <w:tcPr>
+            <w:tcW w:type="dxa" w:w="3005"/>
+          </w:tcPr>
+          <w:p>
+            <w:pPr>
+              <w:spacing w:line="240" w:lineRule="auto" w:before="80" w:after="80"/>
+              <w:jc w:val="left"/>
+            </w:pPr>
+            <w:r/>
+            <w:r>
+              <w:rPr>
+                <w:rFonts w:ascii="Times New Roman" w:hAnsi="Times New Roman" w:eastAsia="Times New Roman"/>
+                <w:b w:val="0"/>
+                <w:i/>
+                <w:color w:val="000000"/>
+                <w:sz w:val="18"/>
+              </w:rPr>
+              <w:t>Zoom sobre la columna derecha. Se detiene tres segundos sobre el mensaje de error en rojo, ampliándolo. Sobreimpresión: «Heurísticas 5 y 9 de Nielsen».</w:t>
+            </w:r>
+          </w:p>
+        </w:tc>
+      </w:tr>
+      <w:tr>
+        <w:tc>
+          <w:tcPr>
+            <w:tcW w:type="dxa" w:w="1077"/>
             <w:tcBorders>
               <w:bottom w:val="single" w:sz="6" w:space="0" w:color="000000"/>
             </w:tcBorders>
@@ -5453,7 +5128,7 @@
                 <w:color w:val="000000"/>
                 <w:sz w:val="18"/>
               </w:rPr>
-              <w:t>1:25 – 2:00</w:t>
+              <w:t>2:00 – 2:45</w:t>
             </w:r>
           </w:p>
         </w:tc>
@@ -5478,7 +5153,7 @@
                 <w:color w:val="000000"/>
                 <w:sz w:val="19"/>
               </w:rPr>
-              <w:t>Y la columna derecha es la que más nos interesa mostrar. Tiene el formulario de orden con pestañas de compra y venta, tipo de orden, precio límite, cantidad con botones de porcentaje del poder de compra, y el resumen de costos. Lo importante está aquí: hemos introducido cinco mil doscientas acciones, que exceden el poder de compra disponible, y la interfaz lo advierte en rojo antes de que el usuario pulse ejecutar, cuantifica el exceso en cinco mil seiscientos ochenta dólares y propone la cantidad máxima admisible. Eso es prevención de errores y ayuda a la recuperación, dos heurísticas de Nielsen aplicadas en un solo control. Sigue Rony Grijalva.</w:t>
+              <w:t>Y aprovecho esta pantalla para responder la Tarea D: cómo el prototipo permite validar la visibilidad del estado del sistema, la primera heurística de Nielsen. Encontramos cuatro puntos comprobables. Uno: las cuatro tarjetas de indicadores comunican el estado del portafolio de forma permanente, sin que el usuario lo pida. Dos: la cabecera del gráfico informa del retardo de los datos, «diferidos quince minutos», que es un dato de estado crítico en bolsa y que ninguna de las cuatro plataformas analizadas muestra con esa claridad. Tres: el conmutador de tema indica siempre qué modo está activo. Y cuatro: el formulario de orden que acaban de ver avisa del exceso de cantidad antes del error, no después. Sigue Rony Grijalva.</w:t>
             </w:r>
           </w:p>
         </w:tc>
@@ -5503,7 +5178,7 @@
                 <w:color w:val="000000"/>
                 <w:sz w:val="18"/>
               </w:rPr>
-              <w:t>Zoom sobre la columna derecha. Se detiene tres segundos sobre el mensaje de error en rojo, ampliándolo. Sobreimpresión: «Heurísticas 5 y 9 de Nielsen».</w:t>
+              <w:t>Cuatro capturas en mosaico, una por punto, que se resaltan en secuencia: tarjetas KPI, cabecera del gráfico con «datos diferidos 15 min», conmutador de tema y mensaje de validación en rojo.</w:t>
             </w:r>
           </w:p>
         </w:tc>
@@ -5524,7 +5199,7 @@
           <w:color w:val="1F3864"/>
           <w:sz w:val="24"/>
         </w:rPr>
-        <w:t>Bloque 10 · Rony Smith Grijalva De La Cruz</w:t>
+        <w:t>Bloque 9 · Rony Smith Grijalva De La Cruz</w:t>
       </w:r>
     </w:p>
     <w:p>
@@ -5541,7 +5216,7 @@
           <w:color w:val="000000"/>
           <w:sz w:val="21"/>
         </w:rPr>
-        <w:t>Código 24200058 · Tema: Pantallas 4 y 5: versión móvil y modo oscuro · Duración prevista: 2 min 15 s</w:t>
+        <w:t>Código 24200058 · Tema: Pantallas 4 y 5, prototipo navegable y comparativa · Duración prevista: 3 min</w:t>
       </w:r>
     </w:p>
     <w:tbl>
@@ -5852,6 +5527,74 @@
         <w:tc>
           <w:tcPr>
             <w:tcW w:type="dxa" w:w="1077"/>
+          </w:tcPr>
+          <w:p>
+            <w:pPr>
+              <w:spacing w:line="240" w:lineRule="auto" w:before="80" w:after="80"/>
+              <w:jc w:val="left"/>
+            </w:pPr>
+            <w:r/>
+            <w:r>
+              <w:rPr>
+                <w:rFonts w:ascii="Times New Roman" w:hAnsi="Times New Roman" w:eastAsia="Times New Roman"/>
+                <w:b w:val="0"/>
+                <w:i w:val="0"/>
+                <w:color w:val="000000"/>
+                <w:sz w:val="18"/>
+              </w:rPr>
+              <w:t>1:25 – 2:15</w:t>
+            </w:r>
+          </w:p>
+        </w:tc>
+        <w:tc>
+          <w:tcPr>
+            <w:tcW w:type="dxa" w:w="4989"/>
+          </w:tcPr>
+          <w:p>
+            <w:pPr>
+              <w:spacing w:line="240" w:lineRule="auto" w:before="80" w:after="80"/>
+              <w:jc w:val="left"/>
+            </w:pPr>
+            <w:r/>
+            <w:r>
+              <w:rPr>
+                <w:rFonts w:ascii="Times New Roman" w:hAnsi="Times New Roman" w:eastAsia="Times New Roman"/>
+                <w:b w:val="0"/>
+                <w:i w:val="0"/>
+                <w:color w:val="000000"/>
+                <w:sz w:val="19"/>
+              </w:rPr>
+              <w:t>Pasemos al modo oscuro. No es un simple cambio de paleta. Ajustamos bordes, sombras y la saturación de los verdes y rojos, porque un rojo saturado sobre fondo negro produce vibración cromática y cansa la vista. Las filas de la tabla alternan entre dos tonos muy próximos para guiar la lectura horizontal, y el elemento activo del menú se resalta con un azul translúcido. El conmutador de tema permanece visible en la barra superior, así que el usuario siempre sabe en qué modo está y puede volver en un clic.</w:t>
+            </w:r>
+          </w:p>
+        </w:tc>
+        <w:tc>
+          <w:tcPr>
+            <w:tcW w:type="dxa" w:w="3005"/>
+          </w:tcPr>
+          <w:p>
+            <w:pPr>
+              <w:spacing w:line="240" w:lineRule="auto" w:before="80" w:after="80"/>
+              <w:jc w:val="left"/>
+            </w:pPr>
+            <w:r/>
+            <w:r>
+              <w:rPr>
+                <w:rFonts w:ascii="Times New Roman" w:hAnsi="Times New Roman" w:eastAsia="Times New Roman"/>
+                <w:b w:val="0"/>
+                <w:i/>
+                <w:color w:val="000000"/>
+                <w:sz w:val="18"/>
+              </w:rPr>
+              <w:t>Se pulsa el conmutador de tema en el Dashboard claro y se pasa a «Dashboard en modo oscuro». Zoom sobre la tabla (filas alternadas), sobre el menú lateral y finalmente sobre el conmutador de tema.</w:t>
+            </w:r>
+          </w:p>
+        </w:tc>
+      </w:tr>
+      <w:tr>
+        <w:tc>
+          <w:tcPr>
+            <w:tcW w:type="dxa" w:w="1077"/>
             <w:tcBorders>
               <w:bottom w:val="single" w:sz="6" w:space="0" w:color="000000"/>
             </w:tcBorders>
@@ -5870,7 +5613,7 @@
                 <w:color w:val="000000"/>
                 <w:sz w:val="18"/>
               </w:rPr>
-              <w:t>1:25 – 2:15</w:t>
+              <w:t>2:15 – 3:00</w:t>
             </w:r>
           </w:p>
         </w:tc>
@@ -5895,7 +5638,7 @@
                 <w:color w:val="000000"/>
                 <w:sz w:val="19"/>
               </w:rPr>
-              <w:t>Pasemos al modo oscuro. No es un simple cambio de paleta. Ajustamos bordes, sombras y la saturación de los verdes y rojos, porque un rojo saturado sobre fondo negro produce vibración cromática y cansa la vista. Las filas de la tabla alternan entre dos tonos muy próximos para guiar la lectura horizontal, y el elemento activo del menú se resalta con un azul translúcido. El conmutador de tema permanece visible en la barra superior, así que el usuario siempre sabe en qué modo está y puede volver en un clic. Continúa Josué Martines con el Leaderboard.</w:t>
+              <w:t>Con las pantallas listas las conectamos en el prototipo navegable: diez conexiones, el doble de las cinco que exige la guía, con retorno al Dashboard desde cualquier punto, de modo que no hay pantallas sin salida. Se lo muestro en vivo. Y una comparación que conviene cerrar aquí: el wireframe nos costó unos quince minutos y sirvió para responder «dónde va cada cosa»; el prototipo de alta fidelidad nos costó unos treinta minutos por pantalla y sirve para responder «se entiende y se puede usar». No compiten: responden preguntas distintas. Continúa Josué Martines con el Leaderboard.</w:t>
             </w:r>
           </w:p>
         </w:tc>
@@ -5920,7 +5663,7 @@
                 <w:color w:val="000000"/>
                 <w:sz w:val="18"/>
               </w:rPr>
-              <w:t>Se pulsa el conmutador de tema en el Dashboard claro y se pasa a «Dashboard en modo oscuro». Zoom sobre la tabla (filas alternadas), sobre el menú lateral y finalmente sobre el conmutador de tema.</w:t>
+              <w:t>Se abre el prototipo de Figma y se hacen tres saltos reales: Dashboard a Watchlist, Watchlist a Ejecución de órdenes y vuelta al Dashboard con el logotipo. Después, el mapa de flujo y la Tabla 7 del informe con la comparación wireframe / alta fidelidad.</w:t>
             </w:r>
           </w:p>
         </w:tc>
@@ -5941,7 +5684,7 @@
           <w:color w:val="1F3864"/>
           <w:sz w:val="24"/>
         </w:rPr>
-        <w:t>Bloque 11 · Josué Martines Cancho</w:t>
+        <w:t>Bloque 10 · Josué Martines Cancho</w:t>
       </w:r>
     </w:p>
     <w:p>
@@ -5958,7 +5701,7 @@
           <w:color w:val="000000"/>
           <w:sz w:val="21"/>
         </w:rPr>
-        <w:t>Código 24200060 · Tema: Pantalla 6: Leaderboard, prototipo navegable y comparativa · Duración prevista: 2 min 15 s</w:t>
+        <w:t>Código 24200060 · Tema: Pantalla 6: Leaderboard (Tarea A), fase del ciclo DCU y cierre · Duración prevista: 2 min 50 s</w:t>
       </w:r>
     </w:p>
     <w:tbl>
@@ -6269,9 +6012,6 @@
         <w:tc>
           <w:tcPr>
             <w:tcW w:type="dxa" w:w="1077"/>
-            <w:tcBorders>
-              <w:bottom w:val="single" w:sz="6" w:space="0" w:color="000000"/>
-            </w:tcBorders>
           </w:tcPr>
           <w:p>
             <w:pPr>
@@ -6287,217 +6027,7 @@
                 <w:color w:val="000000"/>
                 <w:sz w:val="18"/>
               </w:rPr>
-              <w:t>1:35 – 2:15</w:t>
-            </w:r>
-          </w:p>
-        </w:tc>
-        <w:tc>
-          <w:tcPr>
-            <w:tcW w:type="dxa" w:w="4989"/>
-            <w:tcBorders>
-              <w:bottom w:val="single" w:sz="6" w:space="0" w:color="000000"/>
-            </w:tcBorders>
-          </w:tcPr>
-          <w:p>
-            <w:pPr>
-              <w:spacing w:line="240" w:lineRule="auto" w:before="80" w:after="80"/>
-              <w:jc w:val="left"/>
-            </w:pPr>
-            <w:r/>
-            <w:r>
-              <w:rPr>
-                <w:rFonts w:ascii="Times New Roman" w:hAnsi="Times New Roman" w:eastAsia="Times New Roman"/>
-                <w:b w:val="0"/>
-                <w:i w:val="0"/>
-                <w:color w:val="000000"/>
-                <w:sz w:val="19"/>
-              </w:rPr>
-              <w:t>Con las seis pantallas listas, las conectamos en un prototipo navegable con ocho conexiones, tres más de las cinco exigidas, y con retorno al Dashboard desde cualquier punto: no hay pantallas sin salida. Y una última comparación: el wireframe nos costó unos quince minutos y sirvió para responder «dónde va cada cosa»; el prototipo de alta fidelidad nos costó unos treinta minutos por pantalla y sirve para responder «se entiende y se puede usar». No compiten: responden preguntas distintas. Cierra Nicolás Cerna.</w:t>
-            </w:r>
-          </w:p>
-        </w:tc>
-        <w:tc>
-          <w:tcPr>
-            <w:tcW w:type="dxa" w:w="3005"/>
-            <w:tcBorders>
-              <w:bottom w:val="single" w:sz="6" w:space="0" w:color="000000"/>
-            </w:tcBorders>
-          </w:tcPr>
-          <w:p>
-            <w:pPr>
-              <w:spacing w:line="240" w:lineRule="auto" w:before="80" w:after="80"/>
-              <w:jc w:val="left"/>
-            </w:pPr>
-            <w:r/>
-            <w:r>
-              <w:rPr>
-                <w:rFonts w:ascii="Times New Roman" w:hAnsi="Times New Roman" w:eastAsia="Times New Roman"/>
-                <w:b w:val="0"/>
-                <w:i/>
-                <w:color w:val="000000"/>
-                <w:sz w:val="18"/>
-              </w:rPr>
-              <w:t>Se recorre el mapa de flujo del pantalla «mapa de pantallas» y se hacen dos o tres saltos reales entre pantallas. Después, Tabla 7 del informe con la comparación wireframe / alta fidelidad.</w:t>
-            </w:r>
-          </w:p>
-        </w:tc>
-      </w:tr>
-    </w:tbl>
-    <w:p>
-      <w:pPr>
-        <w:pageBreakBefore/>
-        <w:spacing w:line="480" w:lineRule="auto" w:before="280" w:after="0"/>
-        <w:ind w:firstLine="0"/>
-        <w:jc w:val="left"/>
-      </w:pPr>
-      <w:r>
-        <w:rPr>
-          <w:rFonts w:ascii="Times New Roman" w:hAnsi="Times New Roman" w:eastAsia="Times New Roman"/>
-          <w:b/>
-          <w:i w:val="0"/>
-          <w:color w:val="1F3864"/>
-          <w:sz w:val="24"/>
-        </w:rPr>
-        <w:t>Bloque 12 · Augusto Nicolás Cerna Sifuentes</w:t>
-      </w:r>
-    </w:p>
-    <w:p>
-      <w:pPr>
-        <w:spacing w:line="240" w:lineRule="auto" w:before="0" w:after="80"/>
-        <w:ind w:firstLine="0"/>
-        <w:jc w:val="left"/>
-      </w:pPr>
-      <w:r>
-        <w:rPr>
-          <w:rFonts w:ascii="Times New Roman" w:hAnsi="Times New Roman" w:eastAsia="Times New Roman"/>
-          <w:b w:val="0"/>
-          <w:i/>
-          <w:color w:val="000000"/>
-          <w:sz w:val="21"/>
-        </w:rPr>
-        <w:t>Código 24200053 · Tema: Discusión de usabilidad, conclusiones y cierre · Duración prevista: 1 min 45 s</w:t>
-      </w:r>
-    </w:p>
-    <w:tbl>
-      <w:tblPr>
-        <w:tblW w:type="auto" w:w="0"/>
-        <w:tblLayout w:type="fixed"/>
-        <w:tblLook w:firstColumn="1" w:firstRow="1" w:lastColumn="0" w:lastRow="0" w:noHBand="0" w:noVBand="1" w:val="04A0"/>
-      </w:tblPr>
-      <w:tblGrid>
-        <w:gridCol w:w="3120"/>
-        <w:gridCol w:w="3120"/>
-        <w:gridCol w:w="3120"/>
-      </w:tblGrid>
-      <w:tr>
-        <w:tc>
-          <w:tcPr>
-            <w:tcW w:type="dxa" w:w="1077"/>
-            <w:tcBorders>
-              <w:top w:val="single" w:sz="6" w:space="0" w:color="000000"/>
-              <w:left w:val="none" w:sz="0"/>
-              <w:bottom w:val="single" w:sz="6" w:space="0" w:color="000000"/>
-              <w:right w:val="none" w:sz="0"/>
-              <w:insideH w:val="none" w:sz="0"/>
-              <w:insideV w:val="none" w:sz="0"/>
-            </w:tcBorders>
-          </w:tcPr>
-          <w:p>
-            <w:pPr>
-              <w:spacing w:line="240" w:lineRule="auto" w:before="60" w:after="60"/>
-            </w:pPr>
-            <w:r/>
-            <w:r>
-              <w:rPr>
-                <w:rFonts w:ascii="Times New Roman" w:hAnsi="Times New Roman" w:eastAsia="Times New Roman"/>
-                <w:b/>
-                <w:i w:val="0"/>
-                <w:color w:val="000000"/>
-                <w:sz w:val="19"/>
-              </w:rPr>
-              <w:t>Tiempo</w:t>
-            </w:r>
-          </w:p>
-        </w:tc>
-        <w:tc>
-          <w:tcPr>
-            <w:tcW w:type="dxa" w:w="4989"/>
-            <w:tcBorders>
-              <w:top w:val="single" w:sz="6" w:space="0" w:color="000000"/>
-              <w:left w:val="none" w:sz="0"/>
-              <w:bottom w:val="single" w:sz="6" w:space="0" w:color="000000"/>
-              <w:right w:val="none" w:sz="0"/>
-              <w:insideH w:val="none" w:sz="0"/>
-              <w:insideV w:val="none" w:sz="0"/>
-            </w:tcBorders>
-          </w:tcPr>
-          <w:p>
-            <w:pPr>
-              <w:spacing w:line="240" w:lineRule="auto" w:before="60" w:after="60"/>
-            </w:pPr>
-            <w:r/>
-            <w:r>
-              <w:rPr>
-                <w:rFonts w:ascii="Times New Roman" w:hAnsi="Times New Roman" w:eastAsia="Times New Roman"/>
-                <w:b/>
-                <w:i w:val="0"/>
-                <w:color w:val="000000"/>
-                <w:sz w:val="19"/>
-              </w:rPr>
-              <w:t>Guion (lo que se dice)</w:t>
-            </w:r>
-          </w:p>
-        </w:tc>
-        <w:tc>
-          <w:tcPr>
-            <w:tcW w:type="dxa" w:w="3005"/>
-            <w:tcBorders>
-              <w:top w:val="single" w:sz="6" w:space="0" w:color="000000"/>
-              <w:left w:val="none" w:sz="0"/>
-              <w:bottom w:val="single" w:sz="6" w:space="0" w:color="000000"/>
-              <w:right w:val="none" w:sz="0"/>
-              <w:insideH w:val="none" w:sz="0"/>
-              <w:insideV w:val="none" w:sz="0"/>
-            </w:tcBorders>
-          </w:tcPr>
-          <w:p>
-            <w:pPr>
-              <w:spacing w:line="240" w:lineRule="auto" w:before="60" w:after="60"/>
-            </w:pPr>
-            <w:r/>
-            <w:r>
-              <w:rPr>
-                <w:rFonts w:ascii="Times New Roman" w:hAnsi="Times New Roman" w:eastAsia="Times New Roman"/>
-                <w:b/>
-                <w:i w:val="0"/>
-                <w:color w:val="000000"/>
-                <w:sz w:val="19"/>
-              </w:rPr>
-              <w:t>En pantalla (lo que se muestra)</w:t>
-            </w:r>
-          </w:p>
-        </w:tc>
-      </w:tr>
-      <w:tr>
-        <w:tc>
-          <w:tcPr>
-            <w:tcW w:type="dxa" w:w="1077"/>
-          </w:tcPr>
-          <w:p>
-            <w:pPr>
-              <w:spacing w:line="240" w:lineRule="auto" w:before="80" w:after="80"/>
-              <w:jc w:val="left"/>
-            </w:pPr>
-            <w:r/>
-            <w:r>
-              <w:rPr>
-                <w:rFonts w:ascii="Times New Roman" w:hAnsi="Times New Roman" w:eastAsia="Times New Roman"/>
-                <w:b w:val="0"/>
-                <w:i w:val="0"/>
-                <w:color w:val="000000"/>
-                <w:sz w:val="18"/>
-              </w:rPr>
-              <w:t>0:00 – 0:45</w:t>
+              <w:t>1:35 – 1:55</w:t>
             </w:r>
           </w:p>
         </w:tc>
@@ -6519,75 +6049,7 @@
                 <w:color w:val="000000"/>
                 <w:sz w:val="19"/>
               </w:rPr>
-              <w:t>Vuelvo a tomar la palabra para cerrar con la Tarea D. La pregunta era cómo el prototipo permite validar la visibilidad del estado del sistema, la primera heurística de Nielsen. Encontramos cuatro puntos comprobables. Uno: las cuatro tarjetas de indicadores comunican el estado del portafolio de forma permanente, sin que el usuario lo pida. Dos: la cabecera del gráfico informa del retardo de los datos, «diferidos quince minutos», que es un dato de estado crítico en bolsa y que ninguna de las cuatro plataformas analizadas muestra con esa claridad. Tres: el conmutador de tema indica siempre qué modo está activo. Y cuatro: el formulario de orden avisa del exceso de cantidad antes del error, no después.</w:t>
-            </w:r>
-          </w:p>
-        </w:tc>
-        <w:tc>
-          <w:tcPr>
-            <w:tcW w:type="dxa" w:w="3005"/>
-          </w:tcPr>
-          <w:p>
-            <w:pPr>
-              <w:spacing w:line="240" w:lineRule="auto" w:before="80" w:after="80"/>
-              <w:jc w:val="left"/>
-            </w:pPr>
-            <w:r/>
-            <w:r>
-              <w:rPr>
-                <w:rFonts w:ascii="Times New Roman" w:hAnsi="Times New Roman" w:eastAsia="Times New Roman"/>
-                <w:b w:val="0"/>
-                <w:i/>
-                <w:color w:val="000000"/>
-                <w:sz w:val="18"/>
-              </w:rPr>
-              <w:t>Cuatro capturas en mosaico, una por punto, que se resaltan en secuencia: tarjetas KPI, cabecera del gráfico con «datos diferidos 15 min», conmutador de tema y mensaje de validación en rojo.</w:t>
-            </w:r>
-          </w:p>
-        </w:tc>
-      </w:tr>
-      <w:tr>
-        <w:tc>
-          <w:tcPr>
-            <w:tcW w:type="dxa" w:w="1077"/>
-          </w:tcPr>
-          <w:p>
-            <w:pPr>
-              <w:spacing w:line="240" w:lineRule="auto" w:before="80" w:after="80"/>
-              <w:jc w:val="left"/>
-            </w:pPr>
-            <w:r/>
-            <w:r>
-              <w:rPr>
-                <w:rFonts w:ascii="Times New Roman" w:hAnsi="Times New Roman" w:eastAsia="Times New Roman"/>
-                <w:b w:val="0"/>
-                <w:i w:val="0"/>
-                <w:color w:val="000000"/>
-                <w:sz w:val="18"/>
-              </w:rPr>
-              <w:t>0:45 – 1:05</w:t>
-            </w:r>
-          </w:p>
-        </w:tc>
-        <w:tc>
-          <w:tcPr>
-            <w:tcW w:type="dxa" w:w="4989"/>
-          </w:tcPr>
-          <w:p>
-            <w:pPr>
-              <w:spacing w:line="240" w:lineRule="auto" w:before="80" w:after="80"/>
-              <w:jc w:val="left"/>
-            </w:pPr>
-            <w:r/>
-            <w:r>
-              <w:rPr>
-                <w:rFonts w:ascii="Times New Roman" w:hAnsi="Times New Roman" w:eastAsia="Times New Roman"/>
-                <w:b w:val="0"/>
-                <w:i w:val="0"/>
-                <w:color w:val="000000"/>
-                <w:sz w:val="19"/>
-              </w:rPr>
-              <w:t>Y sobre la fase del ciclo: este trabajo se sitúa en «producir soluciones de diseño» de la norma ISO 9241-210, y es la entrada directa de «evaluar los diseños». Las dos primeras actividades del ciclo las cubrimos en las sesiones previas; el ciclo se cerrará cuando sometamos el prototipo a evaluación heurística y a pruebas con usuarios, y esos hallazgos vuelvan a alimentar una nueva vuelta.</w:t>
+              <w:t>Sobre la fase del ciclo en la que se sitúa este trabajo: la norma ISO 9241-210 lo ubica en «producir soluciones de diseño», y es la entrada directa de «evaluar los diseños». Las dos primeras actividades las cubrimos en sesiones previas; el ciclo se cerrará cuando sometamos el prototipo a evaluación heurística y a pruebas con usuarios, y esos hallazgos alimenten una nueva vuelta.</w:t>
             </w:r>
           </w:p>
         </w:tc>
@@ -6633,7 +6095,7 @@
                 <w:color w:val="000000"/>
                 <w:sz w:val="18"/>
               </w:rPr>
-              <w:t>1:05 – 1:35</w:t>
+              <w:t>1:55 – 2:40</w:t>
             </w:r>
           </w:p>
         </w:tc>
@@ -6704,7 +6166,7 @@
                 <w:color w:val="000000"/>
                 <w:sz w:val="18"/>
               </w:rPr>
-              <w:t>1:35 – 1:45</w:t>
+              <w:t>2:40 – 2:50</w:t>
             </w:r>
           </w:p>
         </w:tc>

</xml_diff>